<commit_message>
feat(resume): enhance AI PMM resume with extreme ownership narrative, Ovie's Kitchen founder reporting, and Mt Babs coordination
</commit_message>
<xml_diff>
--- a/ambassadorship role/Adediwura_Afolabi_AI_PMM_Internship_Resume.docx
+++ b/ambassadorship role/Adediwura_Afolabi_AI_PMM_Internship_Resume.docx
@@ -27,21 +27,21 @@
           <w:rFonts w:ascii="Lora" w:cs="Lora" w:eastAsia="Lora" w:hAnsi="Lora"/>
           <w:rtl w:val="0"/>
         </w:rPr>
-        <w:t xml:space="preserve">Lagos, Nigeria (WAT) | Open to Remote | +234 816 555 3106 | adediwura.ainaafolabi@gmail.com</w:t>
-      </w:r>
-    </w:p>
-    <w:p>
-      <w:pPr>
-        <w:rPr>
-          <w:rFonts w:ascii="Lora" w:cs="Lora" w:eastAsia="Lora" w:hAnsi="Lora"/>
-        </w:rPr>
-      </w:pPr>
-      <w:r>
-        <w:rPr>
-          <w:rFonts w:ascii="Lora" w:cs="Lora" w:eastAsia="Lora" w:hAnsi="Lora"/>
-          <w:rtl w:val="0"/>
-        </w:rPr>
-        <w:t xml:space="preserve">LinkedIn: https://linkedin.com/in/adediwura-afolabi | Portfolio &amp; Credentials: https://bit.ly/Adediwuracertificates</w:t>
+        <w:t xml:space="preserve">Lagos / Akure, Nigeria (WAT) | Open to Remote | +234 816 555 3106 | adediwura.ainaafolabi@gmail.com</w:t>
+      </w:r>
+    </w:p>
+    <w:p>
+      <w:pPr>
+        <w:rPr>
+          <w:rFonts w:ascii="Lora" w:cs="Lora" w:eastAsia="Lora" w:hAnsi="Lora"/>
+        </w:rPr>
+      </w:pPr>
+      <w:r>
+        <w:rPr>
+          <w:rFonts w:ascii="Lora" w:cs="Lora" w:eastAsia="Lora" w:hAnsi="Lora"/>
+          <w:rtl w:val="0"/>
+        </w:rPr>
+        <w:t xml:space="preserve">LinkedIn: https://linkedin.com/in/adediwuraafolabi | Portfolio &amp; Credentials: https://bit.ly/Adediwuracertificates</w:t>
       </w:r>
     </w:p>
     <w:p>
@@ -95,7 +95,7 @@
           <w:rFonts w:ascii="Lora" w:cs="Lora" w:eastAsia="Lora" w:hAnsi="Lora"/>
           <w:rtl w:val="0"/>
         </w:rPr>
-        <w:t xml:space="preserve">First-Class Mechatronics Engineering Background (4.70/5.00 CGPA) | SaaS GTM Positioning, Frontline User Acquisition &amp; Automated Revenue Operations</w:t>
+        <w:t xml:space="preserve">First-Class Mechatronics Engineering Background (4.70/5.00 CGPA) | Autonomous Product Marketer &amp; RevOps Automation Builder</w:t>
       </w:r>
     </w:p>
     <w:p>
@@ -177,7 +177,7 @@
           <w:rFonts w:ascii="Lora" w:cs="Lora" w:eastAsia="Lora" w:hAnsi="Lora"/>
           <w:rtl w:val="0"/>
         </w:rPr>
-        <w:t xml:space="preserve">Systems-driven AI Product Marketer and First-Class Mechatronics Engineering undergraduate at the Federal University of Technology Akure (4.70/5.00 CGPA, Best Female Student in Faculty). Bridges complex technical architectures with market psychology to build high-converting Go-To-Market (GTM) launches, crisp value propositions, and autonomous revenue systems. Proven track record in 0-to-1 frontline user acquisition (acquiring first 100+ users from scratch, generating 520+ qualified inbound inquiries, and driving 250+ paid customer transactions) alongside engineering deterministic AI automation pipelines (n8n, conversational AI voice agents, and CRM workflows slashing lead response times from 4 hours to 45 seconds). Seeking an AI Product Marketing Manager Internship to accelerate product adoption, craft compelling technical storytelling, and scale customer acquisition for high-growth SaaS and AI teams.</w:t>
+        <w:t xml:space="preserve">Autonomous, systems-driven AI Product Marketer and First-Class Mechatronics Engineering undergraduate at the Federal University of Technology Akure (4.70/5.00 CGPA, Best Female Student in Faculty). Defined by extreme ownership and end-to-end execution—trusted by founders and cross-functional teams to take complete charge of a project from strategy and creative asset production to launch, scheduling, and conversion. Track record includes reporting directly to founders to resurrect year-long dormant brand channels, acquiring their first online customers from scratch, generating 520+ qualified inbound inquiries, and driving 250+ paid customer transactions. Combines creative distribution with technical orchestration: builds deterministic n8n automation pipelines, conversational AI voice agents, and CRM workflows that slash lead response times from 4 hours to 45 seconds. Seeking an AI Product Marketing Manager Internship to take autonomous ownership of product positioning, technical storytelling, and user acquisition funnels.</w:t>
       </w:r>
     </w:p>
     <w:p>
@@ -397,49 +397,49 @@
           <w:rFonts w:ascii="Lora" w:cs="Lora" w:eastAsia="Lora" w:hAnsi="Lora"/>
           <w:rtl w:val="0"/>
         </w:rPr>
-        <w:t xml:space="preserve">• AI Product Marketing (PMM): Go-To-Market (GTM) Launch Architecture, Positioning &amp; Messaging Hierarchies, ICP &amp; Buyer Persona Profiling, Feature-Benefit-Outcome Translation, Competitive Teardowns &amp; Battlecards, User Journey Mapping, Product Launch Collateral, Onboarding Funnel Optimization.</w:t>
-      </w:r>
-    </w:p>
-    <w:p>
-      <w:pPr>
-        <w:rPr>
-          <w:rFonts w:ascii="Lora" w:cs="Lora" w:eastAsia="Lora" w:hAnsi="Lora"/>
-        </w:rPr>
-      </w:pPr>
-      <w:r>
-        <w:rPr>
-          <w:rFonts w:ascii="Lora" w:cs="Lora" w:eastAsia="Lora" w:hAnsi="Lora"/>
-          <w:rtl w:val="0"/>
-        </w:rPr>
-        <w:t xml:space="preserve">• Autonomous Systems &amp; AI Stack: n8n Workflow Orchestration, Anthropic Claude (Claude 3.5 Sonnet, Claude Code CLI), OpenAI API, Conversational AI Voice Agents (ElevenLabs, Twilio VoIP), Structured JSON Output Extraction, Sensitivity Quarantine Filters, Zero-Hallucination Guardrails, Webhooks &amp; REST APIs, Python Basics.</w:t>
-      </w:r>
-    </w:p>
-    <w:p>
-      <w:pPr>
-        <w:rPr>
-          <w:rFonts w:ascii="Lora" w:cs="Lora" w:eastAsia="Lora" w:hAnsi="Lora"/>
-        </w:rPr>
-      </w:pPr>
-      <w:r>
-        <w:rPr>
-          <w:rFonts w:ascii="Lora" w:cs="Lora" w:eastAsia="Lora" w:hAnsi="Lora"/>
-          <w:rtl w:val="0"/>
-        </w:rPr>
-        <w:t xml:space="preserve">• Growth Marketing &amp; Distribution: Frontline User Acquisition (0-to-100+ Users), Multi-Channel Campaign Execution (LinkedIn, TikTok, Instagram, WhatsApp), On-Page SEO &amp; Content Strategy, Inbound Lead Generation, Email Automation, Digital Asset Design (Canva / Lora Standard).</w:t>
-      </w:r>
-    </w:p>
-    <w:p>
-      <w:pPr>
-        <w:rPr>
-          <w:rFonts w:ascii="Lora" w:cs="Lora" w:eastAsia="Lora" w:hAnsi="Lora"/>
-        </w:rPr>
-      </w:pPr>
-      <w:r>
-        <w:rPr>
-          <w:rFonts w:ascii="Lora" w:cs="Lora" w:eastAsia="Lora" w:hAnsi="Lora"/>
-          <w:rtl w:val="0"/>
-        </w:rPr>
-        <w:t xml:space="preserve">• Operations &amp; Platforms: HubSpot CRM, Google Workspace (Docs, Sheets, Drive, Forms), Git / GitHub, Notion, Slack &amp; Discord Community Architecture.</w:t>
+        <w:t xml:space="preserve">• Product Marketing &amp; GTM Execution: End-to-End Campaign Ownership, 0-to-1 User Acquisition, Value Proposition Design, ICP &amp; Buyer Persona Profiling, 3-Tier Messaging Hierarchies, Competitive Teardowns &amp; Battlecards, Feature-to-Benefit Translation, Onboarding &amp; Conversion Funnel Optimization.</w:t>
+      </w:r>
+    </w:p>
+    <w:p>
+      <w:pPr>
+        <w:rPr>
+          <w:rFonts w:ascii="Lora" w:cs="Lora" w:eastAsia="Lora" w:hAnsi="Lora"/>
+        </w:rPr>
+      </w:pPr>
+      <w:r>
+        <w:rPr>
+          <w:rFonts w:ascii="Lora" w:cs="Lora" w:eastAsia="Lora" w:hAnsi="Lora"/>
+          <w:rtl w:val="0"/>
+        </w:rPr>
+        <w:t xml:space="preserve">• AI Systems &amp; Automation Stack: n8n Workflow Orchestration, Anthropic Claude (Claude 3.5 Sonnet, Claude Code CLI), OpenAI API, Conversational AI Voice Agents (ElevenLabs, Twilio VoIP), Structured JSON Output Extraction, Sensitivity Quarantine Filters, Zero-Hallucination Guardrails, Webhooks &amp; REST APIs, Python Basics.</w:t>
+      </w:r>
+    </w:p>
+    <w:p>
+      <w:pPr>
+        <w:rPr>
+          <w:rFonts w:ascii="Lora" w:cs="Lora" w:eastAsia="Lora" w:hAnsi="Lora"/>
+        </w:rPr>
+      </w:pPr>
+      <w:r>
+        <w:rPr>
+          <w:rFonts w:ascii="Lora" w:cs="Lora" w:eastAsia="Lora" w:hAnsi="Lora"/>
+          <w:rtl w:val="0"/>
+        </w:rPr>
+        <w:t xml:space="preserve">• Creative Production &amp; Distribution: End-to-End Content Ownership (Ideation, Copywriting, Design, Video Production, Scheduling), Short-Form Commercial Video (CapCut, TikTok Studio), Carousel &amp; Visual Asset Design (Canva / Lora Standard), Multi-Channel Distribution (LinkedIn, Instagram, TikTok, WhatsApp), Profile SEO &amp; Visibility Optimization.</w:t>
+      </w:r>
+    </w:p>
+    <w:p>
+      <w:pPr>
+        <w:rPr>
+          <w:rFonts w:ascii="Lora" w:cs="Lora" w:eastAsia="Lora" w:hAnsi="Lora"/>
+        </w:rPr>
+      </w:pPr>
+      <w:r>
+        <w:rPr>
+          <w:rFonts w:ascii="Lora" w:cs="Lora" w:eastAsia="Lora" w:hAnsi="Lora"/>
+          <w:rtl w:val="0"/>
+        </w:rPr>
+        <w:t xml:space="preserve">• Operations &amp; Platforms: HubSpot CRM, Google Workspace (Docs, Sheets, Drive, Forms), Meta Business Suite, Airtable, Notion, Git / GitHub, Slack &amp; Discord Community Architecture.</w:t>
       </w:r>
     </w:p>
     <w:p>
@@ -507,6 +507,116 @@
           <w:rFonts w:ascii="Lora" w:cs="Lora" w:eastAsia="Lora" w:hAnsi="Lora"/>
           <w:rtl w:val="0"/>
         </w:rPr>
+        <w:t xml:space="preserve">Digital Growth Lead &amp; Social Media Strategist | Ovie’s Kitchen &amp; Flowery Nectar Honey</w:t>
+      </w:r>
+    </w:p>
+    <w:p>
+      <w:pPr>
+        <w:rPr>
+          <w:rFonts w:ascii="Lora" w:cs="Lora" w:eastAsia="Lora" w:hAnsi="Lora"/>
+        </w:rPr>
+      </w:pPr>
+      <w:r>
+        <w:rPr>
+          <w:rFonts w:ascii="Lora" w:cs="Lora" w:eastAsia="Lora" w:hAnsi="Lora"/>
+          <w:rtl w:val="0"/>
+        </w:rPr>
+        <w:t xml:space="preserve">May 2025 – Present</w:t>
+      </w:r>
+    </w:p>
+    <w:p>
+      <w:pPr>
+        <w:rPr>
+          <w:rFonts w:ascii="Lora" w:cs="Lora" w:eastAsia="Lora" w:hAnsi="Lora"/>
+        </w:rPr>
+      </w:pPr>
+      <w:r>
+        <w:rPr>
+          <w:rFonts w:ascii="Lora" w:cs="Lora" w:eastAsia="Lora" w:hAnsi="Lora"/>
+          <w:rtl w:val="0"/>
+        </w:rPr>
+        <w:t xml:space="preserve">• Reported directly to the founder, exercising complete autonomous ownership of marketing operations—from strategic ideation (determining what to create, static graphics vs. short-form video) to end-to-end design, video production, copywriting, and multi-channel scheduling.</w:t>
+      </w:r>
+    </w:p>
+    <w:p>
+      <w:pPr>
+        <w:rPr>
+          <w:rFonts w:ascii="Lora" w:cs="Lora" w:eastAsia="Lora" w:hAnsi="Lora"/>
+        </w:rPr>
+      </w:pPr>
+      <w:r>
+        <w:rPr>
+          <w:rFonts w:ascii="Lora" w:cs="Lora" w:eastAsia="Lora" w:hAnsi="Lora"/>
+          <w:rtl w:val="0"/>
+        </w:rPr>
+        <w:t xml:space="preserve">• Reactivated a dormant brand account that had been inactive for an entire year; revamped visual aesthetics, messaging, and search discoverability to establish immediate brand credibility.</w:t>
+      </w:r>
+    </w:p>
+    <w:p>
+      <w:pPr>
+        <w:rPr>
+          <w:rFonts w:ascii="Lora" w:cs="Lora" w:eastAsia="Lora" w:hAnsi="Lora"/>
+        </w:rPr>
+      </w:pPr>
+      <w:r>
+        <w:rPr>
+          <w:rFonts w:ascii="Lora" w:cs="Lora" w:eastAsia="Lora" w:hAnsi="Lora"/>
+          <w:rtl w:val="0"/>
+        </w:rPr>
+        <w:t xml:space="preserve">• Acquired the brand's very first online customers from scratch, generating 520+ qualified inbound buyer inquiries and directly converting 250+ paid commercial transactions within a 3-month launch window.</w:t>
+      </w:r>
+    </w:p>
+    <w:p>
+      <w:pPr>
+        <w:rPr>
+          <w:rFonts w:ascii="Lora" w:cs="Lora" w:eastAsia="Lora" w:hAnsi="Lora"/>
+        </w:rPr>
+      </w:pPr>
+      <w:r>
+        <w:rPr>
+          <w:rFonts w:ascii="Lora" w:cs="Lora" w:eastAsia="Lora" w:hAnsi="Lora"/>
+          <w:rtl w:val="0"/>
+        </w:rPr>
+        <w:t xml:space="preserve">• Increased overall social engagement by 50% across 3 managed accounts within 5 months through consistent, value-driven storytelling and audience interaction.</w:t>
+      </w:r>
+    </w:p>
+    <w:p>
+      <w:pPr>
+        <w:rPr>
+          <w:rFonts w:ascii="Lora" w:cs="Lora" w:eastAsia="Lora" w:hAnsi="Lora"/>
+        </w:rPr>
+      </w:pPr>
+      <w:r>
+        <w:rPr>
+          <w:rFonts w:ascii="Lora" w:cs="Lora" w:eastAsia="Lora" w:hAnsi="Lora"/>
+          <w:rtl w:val="0"/>
+        </w:rPr>
+        <w:t xml:space="preserve">• Tracked performance analytics and audience sentiment loops to continuously refine content funnels, improving profile discoverability and inbound conversion rates by 35%.</w:t>
+      </w:r>
+    </w:p>
+    <w:p>
+      <w:pPr>
+        <w:rPr>
+          <w:rFonts w:ascii="Lora" w:cs="Lora" w:eastAsia="Lora" w:hAnsi="Lora"/>
+        </w:rPr>
+      </w:pPr>
+      <w:r>
+        <w:rPr>
+          <w:rtl w:val="0"/>
+        </w:rPr>
+      </w:r>
+    </w:p>
+    <w:p>
+      <w:pPr>
+        <w:rPr>
+          <w:rFonts w:ascii="Lora" w:cs="Lora" w:eastAsia="Lora" w:hAnsi="Lora"/>
+        </w:rPr>
+      </w:pPr>
+      <w:r>
+        <w:rPr>
+          <w:rFonts w:ascii="Lora" w:cs="Lora" w:eastAsia="Lora" w:hAnsi="Lora"/>
+          <w:rtl w:val="0"/>
+        </w:rPr>
         <w:t xml:space="preserve">AI Product Marketing Specialist &amp; Automation Builder | Contract / Freelance</w:t>
       </w:r>
     </w:p>
@@ -535,35 +645,35 @@
           <w:rFonts w:ascii="Lora" w:cs="Lora" w:eastAsia="Lora" w:hAnsi="Lora"/>
           <w:rtl w:val="0"/>
         </w:rPr>
-        <w:t xml:space="preserve">• Architect and deploy production agentic workflows combining LLMs, REST APIs, and CRM databases to accelerate go-to-market execution and eliminate sales friction for lean teams.</w:t>
-      </w:r>
-    </w:p>
-    <w:p>
-      <w:pPr>
-        <w:rPr>
-          <w:rFonts w:ascii="Lora" w:cs="Lora" w:eastAsia="Lora" w:hAnsi="Lora"/>
-        </w:rPr>
-      </w:pPr>
-      <w:r>
-        <w:rPr>
-          <w:rFonts w:ascii="Lora" w:cs="Lora" w:eastAsia="Lora" w:hAnsi="Lora"/>
-          <w:rtl w:val="0"/>
-        </w:rPr>
-        <w:t xml:space="preserve">• Engineered an autonomous inbound lead qualification and quoting engine in n8n, utilizing structured entity extraction and deterministic business logic to slash lead response time from 4 hours to under 45 seconds (99% reduction).</w:t>
-      </w:r>
-    </w:p>
-    <w:p>
-      <w:pPr>
-        <w:rPr>
-          <w:rFonts w:ascii="Lora" w:cs="Lora" w:eastAsia="Lora" w:hAnsi="Lora"/>
-        </w:rPr>
-      </w:pPr>
-      <w:r>
-        <w:rPr>
-          <w:rFonts w:ascii="Lora" w:cs="Lora" w:eastAsia="Lora" w:hAnsi="Lora"/>
-          <w:rtl w:val="0"/>
-        </w:rPr>
-        <w:t xml:space="preserve">• Formulated structured positioning matrices and 3-tier messaging hierarchies (Strategic Hook, Core Value Pillars, Feature-to-Benefit Proof Points) translating intricate technical software capabilities into high-converting buyer copy.</w:t>
+        <w:t xml:space="preserve">• Architect and deploy production agentic workflows combining LLMs, REST APIs, and CRM databases to accelerate SaaS GTM execution and eliminate manual sales friction for lean teams.</w:t>
+      </w:r>
+    </w:p>
+    <w:p>
+      <w:pPr>
+        <w:rPr>
+          <w:rFonts w:ascii="Lora" w:cs="Lora" w:eastAsia="Lora" w:hAnsi="Lora"/>
+        </w:rPr>
+      </w:pPr>
+      <w:r>
+        <w:rPr>
+          <w:rFonts w:ascii="Lora" w:cs="Lora" w:eastAsia="Lora" w:hAnsi="Lora"/>
+          <w:rtl w:val="0"/>
+        </w:rPr>
+        <w:t xml:space="preserve">• Engineered an autonomous inbound lead qualification and quoting engine in n8n, utilizing structured entity extraction and deterministic business logic to slash lead response times from 4 hours to under 45 seconds (99% reduction) with a 0% error rate.</w:t>
+      </w:r>
+    </w:p>
+    <w:p>
+      <w:pPr>
+        <w:rPr>
+          <w:rFonts w:ascii="Lora" w:cs="Lora" w:eastAsia="Lora" w:hAnsi="Lora"/>
+        </w:rPr>
+      </w:pPr>
+      <w:r>
+        <w:rPr>
+          <w:rFonts w:ascii="Lora" w:cs="Lora" w:eastAsia="Lora" w:hAnsi="Lora"/>
+          <w:rtl w:val="0"/>
+        </w:rPr>
+        <w:t xml:space="preserve">• Formulated full-funnel positioning matrices and 3-tier messaging hierarchies (Strategic Hook, Core Value Pillars, Feature-to-Benefit Proof Points) translating intricate technical architectures into high-converting buyer copy.</w:t>
       </w:r>
     </w:p>
     <w:p>
@@ -617,145 +727,49 @@
           <w:rFonts w:ascii="Lora" w:cs="Lora" w:eastAsia="Lora" w:hAnsi="Lora"/>
           <w:rtl w:val="0"/>
         </w:rPr>
-        <w:t xml:space="preserve">Digital Growth Lead &amp; Social Media Strategist | Ovie’s Kitchen &amp; Flowery Nectar Honey</w:t>
-      </w:r>
-    </w:p>
-    <w:p>
-      <w:pPr>
-        <w:rPr>
-          <w:rFonts w:ascii="Lora" w:cs="Lora" w:eastAsia="Lora" w:hAnsi="Lora"/>
-        </w:rPr>
-      </w:pPr>
-      <w:r>
-        <w:rPr>
-          <w:rFonts w:ascii="Lora" w:cs="Lora" w:eastAsia="Lora" w:hAnsi="Lora"/>
-          <w:rtl w:val="0"/>
-        </w:rPr>
-        <w:t xml:space="preserve">Apr 2025 – Present</w:t>
-      </w:r>
-    </w:p>
-    <w:p>
-      <w:pPr>
-        <w:rPr>
-          <w:rFonts w:ascii="Lora" w:cs="Lora" w:eastAsia="Lora" w:hAnsi="Lora"/>
-        </w:rPr>
-      </w:pPr>
-      <w:r>
-        <w:rPr>
-          <w:rFonts w:ascii="Lora" w:cs="Lora" w:eastAsia="Lora" w:hAnsi="Lora"/>
-          <w:rtl w:val="0"/>
-        </w:rPr>
-        <w:t xml:space="preserve">• Conducted customer discovery and competitor teardowns to identify target buyer pain points, objections, and purchasing triggers across lifestyle and consumer verticals.</w:t>
-      </w:r>
-    </w:p>
-    <w:p>
-      <w:pPr>
-        <w:rPr>
-          <w:rFonts w:ascii="Lora" w:cs="Lora" w:eastAsia="Lora" w:hAnsi="Lora"/>
-        </w:rPr>
-      </w:pPr>
-      <w:r>
-        <w:rPr>
-          <w:rFonts w:ascii="Lora" w:cs="Lora" w:eastAsia="Lora" w:hAnsi="Lora"/>
-          <w:rtl w:val="0"/>
-        </w:rPr>
-        <w:t xml:space="preserve">• Built end-to-end digital acquisition funnels and produced 20+ short-form commercial/educational video assets per month across Instagram and TikTok, acquiring the first 100+ paid users from zero baseline.</w:t>
-      </w:r>
-    </w:p>
-    <w:p>
-      <w:pPr>
-        <w:rPr>
-          <w:rFonts w:ascii="Lora" w:cs="Lora" w:eastAsia="Lora" w:hAnsi="Lora"/>
-        </w:rPr>
-      </w:pPr>
-      <w:r>
-        <w:rPr>
-          <w:rFonts w:ascii="Lora" w:cs="Lora" w:eastAsia="Lora" w:hAnsi="Lora"/>
-          <w:rtl w:val="0"/>
-        </w:rPr>
-        <w:t xml:space="preserve">• Generated 520+ qualified inbound customer inquiries and directly converted 250+ paid commercial transactions within a 3-month launch sprint.</w:t>
-      </w:r>
-    </w:p>
-    <w:p>
-      <w:pPr>
-        <w:rPr>
-          <w:rFonts w:ascii="Lora" w:cs="Lora" w:eastAsia="Lora" w:hAnsi="Lora"/>
-        </w:rPr>
-      </w:pPr>
-      <w:r>
-        <w:rPr>
-          <w:rFonts w:ascii="Lora" w:cs="Lora" w:eastAsia="Lora" w:hAnsi="Lora"/>
-          <w:rtl w:val="0"/>
-        </w:rPr>
-        <w:t xml:space="preserve">• Executed on-page SEO audits and content optimizations across digital touchpoints, increasing organic profile discoverability and inbound conversion rates by 35%.</w:t>
-      </w:r>
-    </w:p>
-    <w:p>
-      <w:pPr>
-        <w:rPr>
-          <w:rFonts w:ascii="Lora" w:cs="Lora" w:eastAsia="Lora" w:hAnsi="Lora"/>
-        </w:rPr>
-      </w:pPr>
-      <w:r>
-        <w:rPr>
-          <w:rFonts w:ascii="Lora" w:cs="Lora" w:eastAsia="Lora" w:hAnsi="Lora"/>
-          <w:rtl w:val="0"/>
-        </w:rPr>
-        <w:t xml:space="preserve">• Managed creative workflows from ideation and copywriting to visual design, client approvals, and post-campaign analytics reporting.</w:t>
-      </w:r>
-    </w:p>
-    <w:p>
-      <w:pPr>
-        <w:rPr>
-          <w:rFonts w:ascii="Lora" w:cs="Lora" w:eastAsia="Lora" w:hAnsi="Lora"/>
-        </w:rPr>
-      </w:pPr>
-      <w:r>
-        <w:rPr>
-          <w:rtl w:val="0"/>
-        </w:rPr>
-      </w:r>
-    </w:p>
-    <w:p>
-      <w:pPr>
-        <w:rPr>
-          <w:rFonts w:ascii="Lora" w:cs="Lora" w:eastAsia="Lora" w:hAnsi="Lora"/>
-        </w:rPr>
-      </w:pPr>
-      <w:r>
-        <w:rPr>
-          <w:rFonts w:ascii="Lora" w:cs="Lora" w:eastAsia="Lora" w:hAnsi="Lora"/>
-          <w:rtl w:val="0"/>
-        </w:rPr>
-        <w:t xml:space="preserve">Technical Content &amp; Communications Specialist | BootClass Academic Community</w:t>
-      </w:r>
-    </w:p>
-    <w:p>
-      <w:pPr>
-        <w:rPr>
-          <w:rFonts w:ascii="Lora" w:cs="Lora" w:eastAsia="Lora" w:hAnsi="Lora"/>
-        </w:rPr>
-      </w:pPr>
-      <w:r>
-        <w:rPr>
-          <w:rFonts w:ascii="Lora" w:cs="Lora" w:eastAsia="Lora" w:hAnsi="Lora"/>
-          <w:rtl w:val="0"/>
-        </w:rPr>
-        <w:t xml:space="preserve">Feb 2023 – Jan 2026</w:t>
-      </w:r>
-    </w:p>
-    <w:p>
-      <w:pPr>
-        <w:rPr>
-          <w:rFonts w:ascii="Lora" w:cs="Lora" w:eastAsia="Lora" w:hAnsi="Lora"/>
-        </w:rPr>
-      </w:pPr>
-      <w:r>
-        <w:rPr>
-          <w:rFonts w:ascii="Lora" w:cs="Lora" w:eastAsia="Lora" w:hAnsi="Lora"/>
-          <w:rtl w:val="0"/>
-        </w:rPr>
-        <w:t xml:space="preserve">• Authored structured technical documentation, learning roadmaps, and educational product briefs translating complex engineering and software concepts into clear, accessible guides for 500+ students.</w:t>
+        <w:t xml:space="preserve">Content Operations &amp; Technical Communications Specialist | BootClass Academic Community</w:t>
+      </w:r>
+    </w:p>
+    <w:p>
+      <w:pPr>
+        <w:rPr>
+          <w:rFonts w:ascii="Lora" w:cs="Lora" w:eastAsia="Lora" w:hAnsi="Lora"/>
+        </w:rPr>
+      </w:pPr>
+      <w:r>
+        <w:rPr>
+          <w:rFonts w:ascii="Lora" w:cs="Lora" w:eastAsia="Lora" w:hAnsi="Lora"/>
+          <w:rtl w:val="0"/>
+        </w:rPr>
+        <w:t xml:space="preserve">Feb 2024 – Present (Volunteer from Feb 2023)</w:t>
+      </w:r>
+    </w:p>
+    <w:p>
+      <w:pPr>
+        <w:rPr>
+          <w:rFonts w:ascii="Lora" w:cs="Lora" w:eastAsia="Lora" w:hAnsi="Lora"/>
+        </w:rPr>
+      </w:pPr>
+      <w:r>
+        <w:rPr>
+          <w:rFonts w:ascii="Lora" w:cs="Lora" w:eastAsia="Lora" w:hAnsi="Lora"/>
+          <w:rtl w:val="0"/>
+        </w:rPr>
+        <w:t xml:space="preserve">• Led cross-functional content operations, directing Graphic Designers and Video Editors to ensure on-brand, high-performing assets across LinkedIn, Instagram, and Facebook.</w:t>
+      </w:r>
+    </w:p>
+    <w:p>
+      <w:pPr>
+        <w:rPr>
+          <w:rFonts w:ascii="Lora" w:cs="Lora" w:eastAsia="Lora" w:hAnsi="Lora"/>
+        </w:rPr>
+      </w:pPr>
+      <w:r>
+        <w:rPr>
+          <w:rFonts w:ascii="Lora" w:cs="Lora" w:eastAsia="Lora" w:hAnsi="Lora"/>
+          <w:rtl w:val="0"/>
+        </w:rPr>
+        <w:t xml:space="preserve">• Authored technical documentation, learning roadmaps, and educational product briefs translating complex engineering and software concepts into clear, accessible guides for 500+ students.</w:t>
       </w:r>
     </w:p>
     <w:p>
@@ -794,10 +808,146 @@
       </w:pPr>
       <w:r>
         <w:rPr>
-          <w:rFonts w:ascii="Lora" w:cs="Lora" w:eastAsia="Lora" w:hAnsi="Lora"/>
-          <w:rtl w:val="0"/>
-        </w:rPr>
-        <w:t xml:space="preserve">• Standardized internal documentation systems and creative visual guidelines, establishing repeatable asset creation workflows and brand consistency.</w:t>
+          <w:rtl w:val="0"/>
+        </w:rPr>
+      </w:r>
+    </w:p>
+    <w:p>
+      <w:pPr>
+        <w:rPr>
+          <w:rFonts w:ascii="Lora" w:cs="Lora" w:eastAsia="Lora" w:hAnsi="Lora"/>
+        </w:rPr>
+      </w:pPr>
+      <w:r>
+        <w:rPr>
+          <w:rFonts w:ascii="Lora" w:cs="Lora" w:eastAsia="Lora" w:hAnsi="Lora"/>
+          <w:rtl w:val="0"/>
+        </w:rPr>
+        <w:t xml:space="preserve">Community Manager | Akure Mechatronics Community</w:t>
+      </w:r>
+    </w:p>
+    <w:p>
+      <w:pPr>
+        <w:rPr>
+          <w:rFonts w:ascii="Lora" w:cs="Lora" w:eastAsia="Lora" w:hAnsi="Lora"/>
+        </w:rPr>
+      </w:pPr>
+      <w:r>
+        <w:rPr>
+          <w:rFonts w:ascii="Lora" w:cs="Lora" w:eastAsia="Lora" w:hAnsi="Lora"/>
+          <w:rtl w:val="0"/>
+        </w:rPr>
+        <w:t xml:space="preserve">Aug 2023 – Jan 2025</w:t>
+      </w:r>
+    </w:p>
+    <w:p>
+      <w:pPr>
+        <w:rPr>
+          <w:rFonts w:ascii="Lora" w:cs="Lora" w:eastAsia="Lora" w:hAnsi="Lora"/>
+        </w:rPr>
+      </w:pPr>
+      <w:r>
+        <w:rPr>
+          <w:rFonts w:ascii="Lora" w:cs="Lora" w:eastAsia="Lora" w:hAnsi="Lora"/>
+          <w:rtl w:val="0"/>
+        </w:rPr>
+        <w:t xml:space="preserve">• Owned community engagement and content programming for robotics, machine learning, and CAD modelling enthusiasts, generating 50+ ideas and discussions per session.</w:t>
+      </w:r>
+    </w:p>
+    <w:p>
+      <w:pPr>
+        <w:rPr>
+          <w:rFonts w:ascii="Lora" w:cs="Lora" w:eastAsia="Lora" w:hAnsi="Lora"/>
+        </w:rPr>
+      </w:pPr>
+      <w:r>
+        <w:rPr>
+          <w:rFonts w:ascii="Lora" w:cs="Lora" w:eastAsia="Lora" w:hAnsi="Lora"/>
+          <w:rtl w:val="0"/>
+        </w:rPr>
+        <w:t xml:space="preserve">• Drove community activation that increased physical workshop and training turnout by 20%.</w:t>
+      </w:r>
+    </w:p>
+    <w:p>
+      <w:pPr>
+        <w:rPr>
+          <w:rFonts w:ascii="Lora" w:cs="Lora" w:eastAsia="Lora" w:hAnsi="Lora"/>
+        </w:rPr>
+      </w:pPr>
+      <w:r>
+        <w:rPr>
+          <w:rFonts w:ascii="Lora" w:cs="Lora" w:eastAsia="Lora" w:hAnsi="Lora"/>
+          <w:rtl w:val="0"/>
+        </w:rPr>
+        <w:t xml:space="preserve">• Moderated monthly technical Twitter (X) Spaces, coordinating guest speakers and technical discussions.</w:t>
+      </w:r>
+    </w:p>
+    <w:p>
+      <w:pPr>
+        <w:rPr>
+          <w:rFonts w:ascii="Lora" w:cs="Lora" w:eastAsia="Lora" w:hAnsi="Lora"/>
+        </w:rPr>
+      </w:pPr>
+      <w:r>
+        <w:rPr>
+          <w:rtl w:val="0"/>
+        </w:rPr>
+      </w:r>
+    </w:p>
+    <w:p>
+      <w:pPr>
+        <w:rPr>
+          <w:rFonts w:ascii="Lora" w:cs="Lora" w:eastAsia="Lora" w:hAnsi="Lora"/>
+        </w:rPr>
+      </w:pPr>
+      <w:r>
+        <w:rPr>
+          <w:rFonts w:ascii="Lora" w:cs="Lora" w:eastAsia="Lora" w:hAnsi="Lora"/>
+          <w:rtl w:val="0"/>
+        </w:rPr>
+        <w:t xml:space="preserve">Content Writer (Remote) | HerAbility Hub</w:t>
+      </w:r>
+    </w:p>
+    <w:p>
+      <w:pPr>
+        <w:rPr>
+          <w:rFonts w:ascii="Lora" w:cs="Lora" w:eastAsia="Lora" w:hAnsi="Lora"/>
+        </w:rPr>
+      </w:pPr>
+      <w:r>
+        <w:rPr>
+          <w:rFonts w:ascii="Lora" w:cs="Lora" w:eastAsia="Lora" w:hAnsi="Lora"/>
+          <w:rtl w:val="0"/>
+        </w:rPr>
+        <w:t xml:space="preserve">July 2023 – Jan 2024</w:t>
+      </w:r>
+    </w:p>
+    <w:p>
+      <w:pPr>
+        <w:rPr>
+          <w:rFonts w:ascii="Lora" w:cs="Lora" w:eastAsia="Lora" w:hAnsi="Lora"/>
+        </w:rPr>
+      </w:pPr>
+      <w:r>
+        <w:rPr>
+          <w:rFonts w:ascii="Lora" w:cs="Lora" w:eastAsia="Lora" w:hAnsi="Lora"/>
+          <w:rtl w:val="0"/>
+        </w:rPr>
+        <w:t xml:space="preserve">• Owned weekly LinkedIn content production (2-3 in-depth articles per week, 500+ words each), driving brand voice and thought leadership.</w:t>
+      </w:r>
+    </w:p>
+    <w:p>
+      <w:pPr>
+        <w:rPr>
+          <w:rFonts w:ascii="Lora" w:cs="Lora" w:eastAsia="Lora" w:hAnsi="Lora"/>
+        </w:rPr>
+      </w:pPr>
+      <w:r>
+        <w:rPr>
+          <w:rFonts w:ascii="Lora" w:cs="Lora" w:eastAsia="Lora" w:hAnsi="Lora"/>
+          <w:rtl w:val="0"/>
+        </w:rPr>
+        <w:t xml:space="preserve">• Implemented user-generated content (UGC) campaigns that boosted organizational visibility and audience reach by 50%.</w:t>
       </w:r>
     </w:p>
     <w:p>
@@ -1083,7 +1233,7 @@
           <w:rFonts w:ascii="Lora" w:cs="Lora" w:eastAsia="Lora" w:hAnsi="Lora"/>
           <w:rtl w:val="0"/>
         </w:rPr>
-        <w:t xml:space="preserve">LEADERSHIP &amp; CAMPUS COMMUNITY EXPERIENCE</w:t>
+        <w:t xml:space="preserve">LEADERSHIP &amp; CAMPUS COMMUNITY INITIATIVES</w:t>
       </w:r>
     </w:p>
     <w:p>
@@ -1111,6 +1261,142 @@
           <w:rFonts w:ascii="Lora" w:cs="Lora" w:eastAsia="Lora" w:hAnsi="Lora"/>
           <w:rtl w:val="0"/>
         </w:rPr>
+        <w:t xml:space="preserve">Lead Organizer &amp; Cross-Functional Director | Mt Babs Foundation Scholars Community</w:t>
+      </w:r>
+    </w:p>
+    <w:p>
+      <w:pPr>
+        <w:rPr>
+          <w:rFonts w:ascii="Lora" w:cs="Lora" w:eastAsia="Lora" w:hAnsi="Lora"/>
+        </w:rPr>
+      </w:pPr>
+      <w:r>
+        <w:rPr>
+          <w:rFonts w:ascii="Lora" w:cs="Lora" w:eastAsia="Lora" w:hAnsi="Lora"/>
+          <w:rtl w:val="0"/>
+        </w:rPr>
+        <w:t xml:space="preserve">2025</w:t>
+      </w:r>
+    </w:p>
+    <w:p>
+      <w:pPr>
+        <w:rPr>
+          <w:rFonts w:ascii="Lora" w:cs="Lora" w:eastAsia="Lora" w:hAnsi="Lora"/>
+        </w:rPr>
+      </w:pPr>
+      <w:r>
+        <w:rPr>
+          <w:rFonts w:ascii="Lora" w:cs="Lora" w:eastAsia="Lora" w:hAnsi="Lora"/>
+          <w:rtl w:val="0"/>
+        </w:rPr>
+        <w:t xml:space="preserve">• Exercised end-to-end operational ownership over a flagship educational leadership webinar, directly managing and coordinating a 17-member student committee across 5 divisions: Publicity &amp; Marketing, Speaker Engagement, Technical Operations, Registration &amp; Documentation, and Seminar Coordination.</w:t>
+      </w:r>
+    </w:p>
+    <w:p>
+      <w:pPr>
+        <w:rPr>
+          <w:rFonts w:ascii="Lora" w:cs="Lora" w:eastAsia="Lora" w:hAnsi="Lora"/>
+        </w:rPr>
+      </w:pPr>
+      <w:r>
+        <w:rPr>
+          <w:rFonts w:ascii="Lora" w:cs="Lora" w:eastAsia="Lora" w:hAnsi="Lora"/>
+          <w:rtl w:val="0"/>
+        </w:rPr>
+        <w:t xml:space="preserve">• Enforced accountability, ran speaker briefings and technical dry runs, and ensured zero-downtime virtual execution, delivering a 100% attendee satisfaction score across 30 tertiary scholars.</w:t>
+      </w:r>
+    </w:p>
+    <w:p>
+      <w:pPr>
+        <w:rPr>
+          <w:rFonts w:ascii="Lora" w:cs="Lora" w:eastAsia="Lora" w:hAnsi="Lora"/>
+        </w:rPr>
+      </w:pPr>
+      <w:r>
+        <w:rPr>
+          <w:rtl w:val="0"/>
+        </w:rPr>
+      </w:r>
+    </w:p>
+    <w:p>
+      <w:pPr>
+        <w:rPr>
+          <w:rFonts w:ascii="Lora" w:cs="Lora" w:eastAsia="Lora" w:hAnsi="Lora"/>
+        </w:rPr>
+      </w:pPr>
+      <w:r>
+        <w:rPr>
+          <w:rFonts w:ascii="Lora" w:cs="Lora" w:eastAsia="Lora" w:hAnsi="Lora"/>
+          <w:rtl w:val="0"/>
+        </w:rPr>
+        <w:t xml:space="preserve">Lead Convener &amp; Program Director | FUTA 400-Level Career &amp; Defense Preparation Seminar</w:t>
+      </w:r>
+    </w:p>
+    <w:p>
+      <w:pPr>
+        <w:rPr>
+          <w:rFonts w:ascii="Lora" w:cs="Lora" w:eastAsia="Lora" w:hAnsi="Lora"/>
+        </w:rPr>
+      </w:pPr>
+      <w:r>
+        <w:rPr>
+          <w:rFonts w:ascii="Lora" w:cs="Lora" w:eastAsia="Lora" w:hAnsi="Lora"/>
+          <w:rtl w:val="0"/>
+        </w:rPr>
+        <w:t xml:space="preserve">2025</w:t>
+      </w:r>
+    </w:p>
+    <w:p>
+      <w:pPr>
+        <w:rPr>
+          <w:rFonts w:ascii="Lora" w:cs="Lora" w:eastAsia="Lora" w:hAnsi="Lora"/>
+        </w:rPr>
+      </w:pPr>
+      <w:r>
+        <w:rPr>
+          <w:rFonts w:ascii="Lora" w:cs="Lora" w:eastAsia="Lora" w:hAnsi="Lora"/>
+          <w:rtl w:val="0"/>
+        </w:rPr>
+        <w:t xml:space="preserve">• Independently conceived, organized, and directed a 2-day virtual seminar for 77 penultimate-year engineering students focused on competitive Industrial Training (IT) placements and research defences.</w:t>
+      </w:r>
+    </w:p>
+    <w:p>
+      <w:pPr>
+        <w:rPr>
+          <w:rFonts w:ascii="Lora" w:cs="Lora" w:eastAsia="Lora" w:hAnsi="Lora"/>
+        </w:rPr>
+      </w:pPr>
+      <w:r>
+        <w:rPr>
+          <w:rFonts w:ascii="Lora" w:cs="Lora" w:eastAsia="Lora" w:hAnsi="Lora"/>
+          <w:rtl w:val="0"/>
+        </w:rPr>
+        <w:t xml:space="preserve">• Built targeted broadcast distribution funnels, sustaining a 95%+ attendance retention rate across both seminar days.</w:t>
+      </w:r>
+    </w:p>
+    <w:p>
+      <w:pPr>
+        <w:rPr>
+          <w:rFonts w:ascii="Lora" w:cs="Lora" w:eastAsia="Lora" w:hAnsi="Lora"/>
+        </w:rPr>
+      </w:pPr>
+      <w:r>
+        <w:rPr>
+          <w:rtl w:val="0"/>
+        </w:rPr>
+      </w:r>
+    </w:p>
+    <w:p>
+      <w:pPr>
+        <w:rPr>
+          <w:rFonts w:ascii="Lora" w:cs="Lora" w:eastAsia="Lora" w:hAnsi="Lora"/>
+        </w:rPr>
+      </w:pPr>
+      <w:r>
+        <w:rPr>
+          <w:rFonts w:ascii="Lora" w:cs="Lora" w:eastAsia="Lora" w:hAnsi="Lora"/>
+          <w:rtl w:val="0"/>
+        </w:rPr>
         <w:t xml:space="preserve">Class Representative | Mechatronics Engineering Department, FUTA</w:t>
       </w:r>
     </w:p>
@@ -1193,142 +1479,6 @@
           <w:rFonts w:ascii="Lora" w:cs="Lora" w:eastAsia="Lora" w:hAnsi="Lora"/>
           <w:rtl w:val="0"/>
         </w:rPr>
-        <w:t xml:space="preserve">Lead Organizer &amp; Cross-Functional Director | Mt Babs Foundation Scholars Community</w:t>
-      </w:r>
-    </w:p>
-    <w:p>
-      <w:pPr>
-        <w:rPr>
-          <w:rFonts w:ascii="Lora" w:cs="Lora" w:eastAsia="Lora" w:hAnsi="Lora"/>
-        </w:rPr>
-      </w:pPr>
-      <w:r>
-        <w:rPr>
-          <w:rFonts w:ascii="Lora" w:cs="Lora" w:eastAsia="Lora" w:hAnsi="Lora"/>
-          <w:rtl w:val="0"/>
-        </w:rPr>
-        <w:t xml:space="preserve">2025</w:t>
-      </w:r>
-    </w:p>
-    <w:p>
-      <w:pPr>
-        <w:rPr>
-          <w:rFonts w:ascii="Lora" w:cs="Lora" w:eastAsia="Lora" w:hAnsi="Lora"/>
-        </w:rPr>
-      </w:pPr>
-      <w:r>
-        <w:rPr>
-          <w:rFonts w:ascii="Lora" w:cs="Lora" w:eastAsia="Lora" w:hAnsi="Lora"/>
-          <w:rtl w:val="0"/>
-        </w:rPr>
-        <w:t xml:space="preserve">• Directed an end-to-end educational leadership webinar, managing a 17-member student committee across Publicity, Speaker Briefing, Technical Infrastructure, and Registration.</w:t>
-      </w:r>
-    </w:p>
-    <w:p>
-      <w:pPr>
-        <w:rPr>
-          <w:rFonts w:ascii="Lora" w:cs="Lora" w:eastAsia="Lora" w:hAnsi="Lora"/>
-        </w:rPr>
-      </w:pPr>
-      <w:r>
-        <w:rPr>
-          <w:rFonts w:ascii="Lora" w:cs="Lora" w:eastAsia="Lora" w:hAnsi="Lora"/>
-          <w:rtl w:val="0"/>
-        </w:rPr>
-        <w:t xml:space="preserve">• Implemented automated post-event follow-up documentation, participant surveys, and resource packages, achieving a 100% attendee satisfaction score across 30 scholars.</w:t>
-      </w:r>
-    </w:p>
-    <w:p>
-      <w:pPr>
-        <w:rPr>
-          <w:rFonts w:ascii="Lora" w:cs="Lora" w:eastAsia="Lora" w:hAnsi="Lora"/>
-        </w:rPr>
-      </w:pPr>
-      <w:r>
-        <w:rPr>
-          <w:rtl w:val="0"/>
-        </w:rPr>
-      </w:r>
-    </w:p>
-    <w:p>
-      <w:pPr>
-        <w:rPr>
-          <w:rFonts w:ascii="Lora" w:cs="Lora" w:eastAsia="Lora" w:hAnsi="Lora"/>
-        </w:rPr>
-      </w:pPr>
-      <w:r>
-        <w:rPr>
-          <w:rFonts w:ascii="Lora" w:cs="Lora" w:eastAsia="Lora" w:hAnsi="Lora"/>
-          <w:rtl w:val="0"/>
-        </w:rPr>
-        <w:t xml:space="preserve">Lead Convener &amp; Program Director | FUTA 400-Level Career &amp; Defense Preparation Seminar</w:t>
-      </w:r>
-    </w:p>
-    <w:p>
-      <w:pPr>
-        <w:rPr>
-          <w:rFonts w:ascii="Lora" w:cs="Lora" w:eastAsia="Lora" w:hAnsi="Lora"/>
-        </w:rPr>
-      </w:pPr>
-      <w:r>
-        <w:rPr>
-          <w:rFonts w:ascii="Lora" w:cs="Lora" w:eastAsia="Lora" w:hAnsi="Lora"/>
-          <w:rtl w:val="0"/>
-        </w:rPr>
-        <w:t xml:space="preserve">2025</w:t>
-      </w:r>
-    </w:p>
-    <w:p>
-      <w:pPr>
-        <w:rPr>
-          <w:rFonts w:ascii="Lora" w:cs="Lora" w:eastAsia="Lora" w:hAnsi="Lora"/>
-        </w:rPr>
-      </w:pPr>
-      <w:r>
-        <w:rPr>
-          <w:rFonts w:ascii="Lora" w:cs="Lora" w:eastAsia="Lora" w:hAnsi="Lora"/>
-          <w:rtl w:val="0"/>
-        </w:rPr>
-        <w:t xml:space="preserve">• Conceived, organized, and directed a 2-day virtual seminar for 77 penultimate-year engineering students focused on competitive Industrial Training (IT) placements and project defence execution.</w:t>
-      </w:r>
-    </w:p>
-    <w:p>
-      <w:pPr>
-        <w:rPr>
-          <w:rFonts w:ascii="Lora" w:cs="Lora" w:eastAsia="Lora" w:hAnsi="Lora"/>
-        </w:rPr>
-      </w:pPr>
-      <w:r>
-        <w:rPr>
-          <w:rFonts w:ascii="Lora" w:cs="Lora" w:eastAsia="Lora" w:hAnsi="Lora"/>
-          <w:rtl w:val="0"/>
-        </w:rPr>
-        <w:t xml:space="preserve">• Built targeted broadcast distribution funnels, achieving a 95%+ attendance retention rate across both seminar days.</w:t>
-      </w:r>
-    </w:p>
-    <w:p>
-      <w:pPr>
-        <w:rPr>
-          <w:rFonts w:ascii="Lora" w:cs="Lora" w:eastAsia="Lora" w:hAnsi="Lora"/>
-        </w:rPr>
-      </w:pPr>
-      <w:r>
-        <w:rPr>
-          <w:rtl w:val="0"/>
-        </w:rPr>
-      </w:r>
-    </w:p>
-    <w:p>
-      <w:pPr>
-        <w:rPr>
-          <w:rFonts w:ascii="Lora" w:cs="Lora" w:eastAsia="Lora" w:hAnsi="Lora"/>
-        </w:rPr>
-      </w:pPr>
-      <w:r>
-        <w:rPr>
-          <w:rFonts w:ascii="Lora" w:cs="Lora" w:eastAsia="Lora" w:hAnsi="Lora"/>
-          <w:rtl w:val="0"/>
-        </w:rPr>
         <w:t xml:space="preserve">-------------------------------------------------------------------</w:t>
       </w:r>
     </w:p>
@@ -1413,7 +1563,35 @@
           <w:rFonts w:ascii="Lora" w:cs="Lora" w:eastAsia="Lora" w:hAnsi="Lora"/>
           <w:rtl w:val="0"/>
         </w:rPr>
-        <w:t xml:space="preserve">• Content Marketing Certification: Comprehensive credential covering Inbound Marketing, Copywriting &amp; Audience Engagement</w:t>
+        <w:t xml:space="preserve">• Certificate of Excellence at NUESA Oratory Contest: Nigerian Universities Engineering Students' Association</w:t>
+      </w:r>
+    </w:p>
+    <w:p>
+      <w:pPr>
+        <w:rPr>
+          <w:rFonts w:ascii="Lora" w:cs="Lora" w:eastAsia="Lora" w:hAnsi="Lora"/>
+        </w:rPr>
+      </w:pPr>
+      <w:r>
+        <w:rPr>
+          <w:rFonts w:ascii="Lora" w:cs="Lora" w:eastAsia="Lora" w:hAnsi="Lora"/>
+          <w:rtl w:val="0"/>
+        </w:rPr>
+        <w:t xml:space="preserve">• Most Social Volunteer Award: BootClass Community Honors (Session 2023/2024)</w:t>
+      </w:r>
+    </w:p>
+    <w:p>
+      <w:pPr>
+        <w:rPr>
+          <w:rFonts w:ascii="Lora" w:cs="Lora" w:eastAsia="Lora" w:hAnsi="Lora"/>
+        </w:rPr>
+      </w:pPr>
+      <w:r>
+        <w:rPr>
+          <w:rFonts w:ascii="Lora" w:cs="Lora" w:eastAsia="Lora" w:hAnsi="Lora"/>
+          <w:rtl w:val="0"/>
+        </w:rPr>
+        <w:t xml:space="preserve">• Content Marketing Certification: HubSpot Academy (Inbound Marketing, Copywriting &amp; Audience Engagement)</w:t>
       </w:r>
     </w:p>
     <w:p>
@@ -1446,7 +1624,9 @@
     </w:p>
     <w:p>
       <w:pPr>
-        <w:rPr/>
+        <w:rPr>
+          <w:rFonts w:ascii="Lora" w:cs="Lora" w:eastAsia="Lora" w:hAnsi="Lora"/>
+        </w:rPr>
       </w:pPr>
       <w:r>
         <w:rPr>

</xml_diff>